<commit_message>
Trimestral report 1: language practice row added
</commit_message>
<xml_diff>
--- a/trimestral-progress-report-1-september-2026.docx
+++ b/trimestral-progress-report-1-september-2026.docx
@@ -2086,6 +2086,135 @@
                 <w:sz w:val="22"/>
                 <w:szCs w:val="22"/>
               </w:rPr>
+              <w:t>D.3.1</w:t>
+            </w:r>
+          </w:p>
+        </w:tc>
+        <w:tc>
+          <w:tcPr>
+            <w:tcW w:w="2797" w:type="dxa"/>
+            <w:tcBorders>
+              <w:top w:val="single" w:sz="4" w:space="0" w:color="8C8C8C"/>
+              <w:left w:val="none" w:sz="0" w:space="0" w:color="FFFFFF"/>
+              <w:bottom w:val="single" w:sz="4" w:space="0" w:color="8C8C8C"/>
+              <w:right w:val="none" w:sz="0" w:space="0" w:color="FFFFFF"/>
+            </w:tcBorders>
+            <w:tcMar>
+              <w:top w:w="55" w:type="dxa"/>
+              <w:left w:w="90" w:type="dxa"/>
+              <w:bottom w:w="55" w:type="dxa"/>
+              <w:right w:w="120" w:type="dxa"/>
+            </w:tcMar>
+          </w:tcPr>
+          <w:p>
+            <w:pPr>
+              <w:spacing w:line="264" w:lineRule="auto"/>
+            </w:pPr>
+            <w:r>
+              <w:rPr>
+                <w:sz w:val="22"/>
+                <w:szCs w:val="22"/>
+              </w:rPr>
+              <w:t>Language practice, Tongan and Shikomori</w:t>
+            </w:r>
+          </w:p>
+        </w:tc>
+        <w:tc>
+          <w:tcPr>
+            <w:tcW w:w="1591" w:type="dxa"/>
+            <w:tcBorders>
+              <w:top w:val="single" w:sz="4" w:space="0" w:color="8C8C8C"/>
+              <w:left w:val="none" w:sz="0" w:space="0" w:color="FFFFFF"/>
+              <w:bottom w:val="single" w:sz="4" w:space="0" w:color="8C8C8C"/>
+              <w:right w:val="none" w:sz="0" w:space="0" w:color="FFFFFF"/>
+            </w:tcBorders>
+            <w:tcMar>
+              <w:top w:w="55" w:type="dxa"/>
+              <w:left w:w="90" w:type="dxa"/>
+              <w:bottom w:w="55" w:type="dxa"/>
+              <w:right w:w="120" w:type="dxa"/>
+            </w:tcMar>
+          </w:tcPr>
+          <w:p>
+            <w:pPr>
+              <w:spacing w:line="264" w:lineRule="auto"/>
+            </w:pPr>
+            <w:r>
+              <w:rPr>
+                <w:sz w:val="22"/>
+                <w:szCs w:val="22"/>
+              </w:rPr>
+              <w:t>Under way</w:t>
+            </w:r>
+          </w:p>
+        </w:tc>
+        <w:tc>
+          <w:tcPr>
+            <w:tcW w:w="3945" w:type="dxa"/>
+            <w:tcBorders>
+              <w:top w:val="single" w:sz="4" w:space="0" w:color="8C8C8C"/>
+              <w:left w:val="none" w:sz="0" w:space="0" w:color="FFFFFF"/>
+              <w:bottom w:val="single" w:sz="4" w:space="0" w:color="8C8C8C"/>
+              <w:right w:val="none" w:sz="0" w:space="0" w:color="FFFFFF"/>
+            </w:tcBorders>
+            <w:tcMar>
+              <w:top w:w="55" w:type="dxa"/>
+              <w:left w:w="90" w:type="dxa"/>
+              <w:bottom w:w="55" w:type="dxa"/>
+              <w:right w:w="120" w:type="dxa"/>
+            </w:tcMar>
+          </w:tcPr>
+          <w:p>
+            <w:pPr>
+              <w:spacing w:line="264" w:lineRule="auto"/>
+            </w:pPr>
+            <w:r>
+              <w:rPr>
+                <w:sz w:val="22"/>
+                <w:szCs w:val="22"/>
+              </w:rPr>
+              <w:t>Practice is happening but is not logged, so a simple record of dates and minutes is needed as evidence before milestone M.3.2 in March 2027</w:t>
+            </w:r>
+          </w:p>
+        </w:tc>
+      </w:tr>
+      <w:tr>
+        <w:tblPrEx>
+          <w:tblCellMar>
+            <w:top w:w="0" w:type="dxa"/>
+            <w:bottom w:w="0" w:type="dxa"/>
+          </w:tblCellMar>
+        </w:tblPrEx>
+        <w:trPr>
+          <w:cantSplit/>
+        </w:trPr>
+        <w:tc>
+          <w:tcPr>
+            <w:tcW w:w="964" w:type="dxa"/>
+            <w:tcBorders>
+              <w:top w:val="single" w:sz="4" w:space="0" w:color="8C8C8C"/>
+              <w:left w:val="none" w:sz="0" w:space="0" w:color="FFFFFF"/>
+              <w:bottom w:val="single" w:sz="4" w:space="0" w:color="8C8C8C"/>
+              <w:right w:val="none" w:sz="0" w:space="0" w:color="FFFFFF"/>
+            </w:tcBorders>
+            <w:tcMar>
+              <w:top w:w="55" w:type="dxa"/>
+              <w:left w:w="90" w:type="dxa"/>
+              <w:bottom w:w="55" w:type="dxa"/>
+              <w:right w:w="120" w:type="dxa"/>
+            </w:tcMar>
+          </w:tcPr>
+          <w:p>
+            <w:pPr>
+              <w:spacing w:line="264" w:lineRule="auto"/>
+            </w:pPr>
+            <w:r>
+              <w:rPr>
+                <w:b/>
+                <w:bCs/>
+                <w:sz w:val="22"/>
+                <w:szCs w:val="22"/>
+              </w:rPr>
               <w:t>D.3.2</w:t>
             </w:r>
           </w:p>
@@ -2845,7 +2974,7 @@
           <w:sz w:val="21"/>
           <w:szCs w:val="21"/>
         </w:rPr>
-        <w:t xml:space="preserve">Codes follow the grant agreement: D is a deliverable and M a milestone, and the first number is the work package (WP), so D.5.1 is the first deliverable of Work Package 5. DOC and ISS codes are University of Malta study units.</w:t>
+        <w:t xml:space="preserve">Codes follow the grant agreement: D is a deliverable and M a milestone, and the first number is the work package (WP), so D.5.1 is the first deliverable of Work Package 5. DOC and ISS codes are University of Malta study units. The Year 1 deliverables that begin after December 2026 are not listed here, and none has begun: D.3.4, M.2.1, M.3.1, M.3.2, D.4.1, D.4.4, D.6.1, D.6.2 and D.7.1.</w:t>
       </w:r>
     </w:p>
     <w:p>

</xml_diff>